<commit_message>
Remove orphaned ranking image placeholder from humanize draft
Co-Authored-By: Claude Opus 5.5 <noreply@anthropic.com>
Claude-Session: https://claude.ai/code/session_01GQXcnZLn4f9MkUS7SEqp5J
</commit_message>
<xml_diff>
--- a/blog-content/old-drafts-fixed/How-to-Humanize-AI-Content-FIXED.docx
+++ b/blog-content/old-drafts-fixed/How-to-Humanize-AI-Content-FIXED.docx
@@ -134,7 +134,7 @@
       <w:r>
         <w:t xml:space="preserve">After editing over 60 AI-drafted articles for </w:t>
       </w:r>
-      <w:hyperlink w:history="1" r:id="rIdctgw1mmr3hqky_ek2zuix">
+      <w:hyperlink w:history="1" r:id="rId4lvff8nuh2q5be0ppnqiz">
         <w:r>
           <w:rPr>
             <w:rStyle w:val="Hyperlink"/>
@@ -150,7 +150,7 @@
       <w:r>
         <w:t xml:space="preserve">This guide gives you a repeatable editing workflow with specific before-and-after examples, verified ranking data, and the exact process I use to turn a raw AI draft into something Google wants to surface and readers want to finish. For the wider picture, see the </w:t>
       </w:r>
-      <w:hyperlink w:history="1" r:id="rIdp8g9geli-2cky-a26nida">
+      <w:hyperlink w:history="1" r:id="rId930dsvruaimtfzuouqtsx">
         <w:r>
           <w:rPr>
             <w:rStyle w:val="Hyperlink"/>
@@ -179,7 +179,7 @@
       <w:r>
         <w:t xml:space="preserve">A </w:t>
       </w:r>
-      <w:hyperlink w:history="1" r:id="rIdxarlhxixkcqlwos5pmig3">
+      <w:hyperlink w:history="1" r:id="rIduekpysl3kxwi8w1krhwxj">
         <w:r>
           <w:rPr>
             <w:rStyle w:val="Hyperlink"/>
@@ -213,7 +213,7 @@
       <w:r>
         <w:t xml:space="preserve">Beyond the maths, readers sense something off before they can name it. They feel the absence of opinion, the lack of a real person behind the words. An </w:t>
       </w:r>
-      <w:hyperlink w:history="1" r:id="rIdctupwqx18nv56qsjrklvg">
+      <w:hyperlink w:history="1" r:id="rIdizldhv-axqeykj3yxlugg">
         <w:r>
           <w:rPr>
             <w:rStyle w:val="Hyperlink"/>
@@ -252,7 +252,7 @@
       <w:r>
         <w:t xml:space="preserve">Every recommendation in this guide targets the reader-first approach. If your main concern is "bypassing AI detectors," you're optimising for the wrong metric. Detectors also flag plenty of human writing; run a draft through our free </w:t>
       </w:r>
-      <w:hyperlink w:history="1" r:id="rIdqwnxzdyuoqjmdz21uzqyd">
+      <w:hyperlink w:history="1" r:id="rId0xm-wvecmmfuu0keky1-u">
         <w:r>
           <w:rPr>
             <w:rStyle w:val="Hyperlink"/>
@@ -276,7 +276,7 @@
       <w:r>
         <w:t xml:space="preserve">Here is the exact 8-step editing workflow I use for every AI-drafted article on this site. The whole process takes 60 to 90 minutes per piece — a fraction of the </w:t>
       </w:r>
-      <w:hyperlink w:history="1" r:id="rIdrswgpj_qwdel5glwjunqa">
+      <w:hyperlink w:history="1" r:id="rId55gukauwl0myhnswhv3ct">
         <w:r>
           <w:rPr>
             <w:rStyle w:val="Hyperlink"/>
@@ -305,7 +305,7 @@
       <w:r>
         <w:t xml:space="preserve">A prompt like "write a blog post about email marketing" produces generic fluff. A prompt like "write a 2,000-word guide on re-engagement email sequences for SaaS companies with 30-day trial models, written in first person, referencing a churn rate we reduced from 8.2% to 5.1%" produces something worth editing. I break down this process fully in my </w:t>
       </w:r>
-      <w:hyperlink w:history="1" r:id="rIdr1iaokqcegat8sksupk2h">
+      <w:hyperlink w:history="1" r:id="rIdqyzekpmdccgqltd0z3bff">
         <w:r>
           <w:rPr>
             <w:rStyle w:val="Hyperlink"/>
@@ -481,7 +481,7 @@
       <w:r>
         <w:t xml:space="preserve">I've caught AI fabricating entire studies — complete with plausible-sounding journal names and publication years. If you can't find the original source within two minutes of searching, delete the claim. A wrong citation damages your credibility more than a missing one. This is where I've seen the most damage in </w:t>
       </w:r>
-      <w:hyperlink w:history="1" r:id="rIdsvjrrbqwjw5loq4iyfs2t">
+      <w:hyperlink w:history="1" r:id="rIdcqrveeuyqjdkqznxbhhnx">
         <w:r>
           <w:rPr>
             <w:rStyle w:val="Hyperlink"/>
@@ -575,7 +575,7 @@
       <w:r>
         <w:t xml:space="preserve">Google's </w:t>
       </w:r>
-      <w:hyperlink w:history="1" r:id="rIdo3ozfcxtdmo1oo70466ti">
+      <w:hyperlink w:history="1" r:id="rIdkorujowdrt0vaqxgzcwlg">
         <w:r>
           <w:rPr>
             <w:rStyle w:val="Hyperlink"/>
@@ -661,7 +661,7 @@
       <w:r>
         <w:t xml:space="preserve">Large studies point the same way: unedited AI pages rarely hold the top spot, while edited AI drafts rank close to human writing. I break down those numbers, and what they miss, in </w:t>
       </w:r>
-      <w:hyperlink w:history="1" r:id="rId5xzpjihls2z3tmuqt43sv">
+      <w:hyperlink w:history="1" r:id="rIdg8a9uwwcilgplts4bouky">
         <w:r>
           <w:rPr>
             <w:rStyle w:val="Hyperlink"/>
@@ -677,7 +677,7 @@
       <w:r>
         <w:t xml:space="preserve">The clearest proof comes from </w:t>
       </w:r>
-      <w:hyperlink w:history="1" r:id="rIdng1kgtljmcvvraelcgyxa">
+      <w:hyperlink w:history="1" r:id="rIdmo9oyaa1u3q9efzm6t1rf">
         <w:r>
           <w:rPr>
             <w:rStyle w:val="Hyperlink"/>
@@ -850,7 +850,7 @@
       <w:r>
         <w:t xml:space="preserve">For a cost comparison with hiring a freelancer, see </w:t>
       </w:r>
-      <w:hyperlink w:history="1" r:id="rId3nwrphex8fdacyax9grdp">
+      <w:hyperlink w:history="1" r:id="rIdr2xvtk_mbwggmms6htlvw">
         <w:r>
           <w:rPr>
             <w:rStyle w:val="Hyperlink"/>
@@ -861,7 +861,7 @@
       <w:r>
         <w:t xml:space="preserve">. To choose a drafting tool, start with the </w:t>
       </w:r>
-      <w:hyperlink w:history="1" r:id="rIdrj7nt9vhm1jiewqysbitg">
+      <w:hyperlink w:history="1" r:id="rIdsss0jrwfa-q7kyxtuvkv0">
         <w:r>
           <w:rPr>
             <w:rStyle w:val="Hyperlink"/>
@@ -919,7 +919,7 @@
       <w:r>
         <w:t xml:space="preserve"> — flags overly complex sentences, passive voice, and adverb overuse. Treats the readability problem, not the detection problem. Our free </w:t>
       </w:r>
-      <w:hyperlink w:history="1" r:id="rIdv4sbl4ey0vb0yv-_hvwrw">
+      <w:hyperlink w:history="1" r:id="rId-r76mpnodzc6jjayn140c">
         <w:r>
           <w:rPr>
             <w:rStyle w:val="Hyperlink"/>
@@ -949,7 +949,7 @@
       <w:r>
         <w:t xml:space="preserve"> — fine for one clunky sentence, not for a whole article. Our </w:t>
       </w:r>
-      <w:hyperlink w:history="1" r:id="rIdo4gm0ipwgo-_qhw28jlsy">
+      <w:hyperlink w:history="1" r:id="rIdukyvu4ej1akjsq-gp9oje">
         <w:r>
           <w:rPr>
             <w:rStyle w:val="Hyperlink"/>
@@ -960,7 +960,7 @@
       <w:r>
         <w:t xml:space="preserve"> shows the changes so you can keep only the ones that read better. </w:t>
       </w:r>
-      <w:hyperlink w:history="1" r:id="rIdsk9eosksnwdn2frov4ke-">
+      <w:hyperlink w:history="1" r:id="rIdak8irj5j-6h9ju9vefmqa">
         <w:r>
           <w:rPr>
             <w:rStyle w:val="Hyperlink"/>
@@ -1014,7 +1014,7 @@
       <w:r>
         <w:t xml:space="preserve">The best humanizer is your own editing time — roughly an hour per piece. No tool replaces the value of someone who has done the thing the article talks about sitting down and making the content real. If you'd rather hand the editing over, that's what our </w:t>
       </w:r>
-      <w:hyperlink w:history="1" r:id="rId864uhlc4sxnevwocjulmr">
+      <w:hyperlink w:history="1" r:id="rIdewaelvx9l73dnzakv4you">
         <w:r>
           <w:rPr>
             <w:rStyle w:val="Hyperlink"/>
@@ -1038,7 +1038,7 @@
       <w:r>
         <w:t xml:space="preserve">Google judges quality, not origin: </w:t>
       </w:r>
-      <w:hyperlink w:history="1" r:id="rIdltvhvs-ud09r3k3pzrx9s">
+      <w:hyperlink w:history="1" r:id="rId7n30iqbimf_fjjfzvv2u0">
         <w:r>
           <w:rPr>
             <w:rStyle w:val="Hyperlink"/>
@@ -1049,7 +1049,7 @@
       <w:r>
         <w:t xml:space="preserve"> rewards helpful content however it was produced and targets scaled, unedited pages. Detection, spam policies and what that means for your site are covered in </w:t>
       </w:r>
-      <w:hyperlink w:history="1" r:id="rId3ezqrtqeaitoujg8jrs6c">
+      <w:hyperlink w:history="1" r:id="rIdxjxxgfjrujg9p5suxbzef">
         <w:r>
           <w:rPr>
             <w:rStyle w:val="Hyperlink"/>

</xml_diff>